<commit_message>
Finaler Stand Version 11.08.2026
</commit_message>
<xml_diff>
--- a/Projektbeschreibung_bwb.de_befuellt.docx
+++ b/Projektbeschreibung_bwb.de_befuellt.docx
@@ -1469,38 +1469,6 @@
           <w:sz w:val="19"/>
         </w:rPr>
         <w:t>Ebenfalls nicht Gegenstand dieser Bestandsaufnahme sind die außerhalb des CMS betriebenen Portale und Fachanwendungen (u. a. kundenportal.bwb.de, registrierung.bwb.de, h2pro.bwb.de, apps.bwb.de, jobs.bwb.de, marke.bwb.de, zso.berlinwasser.de). Sie werden in Abschnitt 3 ausschließlich als angebundene bzw. verlinkte Umsysteme aufgeführt, weil ihr Einstieg aus bwb.de heraus erfolgt und beim Aufsetzen des Angebots im neuen CMS berücksichtigt werden muss.</w:t>
-      </w:r>
-    </w:p>
-    <w:p>
-      <w:pPr>
-        <w:shd w:val="clear" w:color="auto" w:fill="F8FAFC"/>
-        <w:spacing w:after="160" w:line="264" w:lineRule="auto"/>
-      </w:pPr>
-      <w:r>
-        <w:rPr>
-          <w:rFonts w:eastAsia="Calibri"/>
-          <w:color w:val="000000"/>
-          <w:sz w:val="19"/>
-        </w:rPr>
-        <w:t xml:space="preserve">Hinweis zur Quellenlage: Die Angaben in Abschnitt 2 stammen aus dem </w:t>
-      </w:r>
-      <w:proofErr w:type="spellStart"/>
-      <w:r>
-        <w:rPr>
-          <w:rFonts w:eastAsia="Calibri"/>
-          <w:color w:val="000000"/>
-          <w:sz w:val="19"/>
-        </w:rPr>
-        <w:t>Contentklassen</w:t>
-      </w:r>
-      <w:proofErr w:type="spellEnd"/>
-      <w:r>
-        <w:rPr>
-          <w:rFonts w:eastAsia="Calibri"/>
-          <w:color w:val="000000"/>
-          <w:sz w:val="19"/>
-        </w:rPr>
-        <w:t>-Report. Die Angaben in den Abschnitten 1 sowie 3 bis 5 wurden ergänzend aus dem öffentlich zugänglichen Webangebot www.bwb.de recherchiert (Recherchestand 10.08.2026). Sie sind als Recherchestand gekennzeichnet und BWB-seitig zu bestätigen.</w:t>
       </w:r>
     </w:p>
     <w:p>
@@ -2692,7 +2660,6 @@
                 <w:color w:val="000000"/>
                 <w:sz w:val="17"/>
               </w:rPr>
-              <w:lastRenderedPageBreak/>
               <w:t>Expandable-Box</w:t>
             </w:r>
           </w:p>
@@ -2921,6 +2888,7 @@
                 <w:color w:val="000000"/>
                 <w:sz w:val="17"/>
               </w:rPr>
+              <w:lastRenderedPageBreak/>
               <w:t>Bild links Box</w:t>
             </w:r>
           </w:p>
@@ -4989,7 +4957,6 @@
                 <w:color w:val="000000"/>
                 <w:sz w:val="17"/>
               </w:rPr>
-              <w:lastRenderedPageBreak/>
               <w:t>Menu Sektion [Sektion]</w:t>
             </w:r>
           </w:p>
@@ -5221,6 +5188,7 @@
                 <w:color w:val="000000"/>
                 <w:sz w:val="17"/>
               </w:rPr>
+              <w:lastRenderedPageBreak/>
               <w:t>Newswall</w:t>
             </w:r>
             <w:proofErr w:type="spellEnd"/>
@@ -7317,7 +7285,6 @@
                 <w:color w:val="000000"/>
                 <w:sz w:val="17"/>
               </w:rPr>
-              <w:lastRenderedPageBreak/>
               <w:t>Stage Klickgalerie</w:t>
             </w:r>
           </w:p>
@@ -7557,6 +7524,7 @@
                 <w:color w:val="000000"/>
                 <w:sz w:val="17"/>
               </w:rPr>
+              <w:lastRenderedPageBreak/>
               <w:t>box_application</w:t>
             </w:r>
             <w:proofErr w:type="spellEnd"/>
@@ -9645,7 +9613,6 @@
                 <w:color w:val="000000"/>
                 <w:sz w:val="17"/>
               </w:rPr>
-              <w:lastRenderedPageBreak/>
               <w:t>Icon-Block</w:t>
             </w:r>
           </w:p>
@@ -9874,6 +9841,7 @@
                 <w:color w:val="000000"/>
                 <w:sz w:val="17"/>
               </w:rPr>
+              <w:lastRenderedPageBreak/>
               <w:t>Expandable-Box-Video</w:t>
             </w:r>
           </w:p>
@@ -11967,7 +11935,6 @@
                 <w:color w:val="000000"/>
                 <w:sz w:val="17"/>
               </w:rPr>
-              <w:lastRenderedPageBreak/>
               <w:t>form_contact_presseverteiler</w:t>
             </w:r>
             <w:proofErr w:type="spellEnd"/>
@@ -12200,6 +12167,7 @@
                 <w:color w:val="000000"/>
                 <w:sz w:val="17"/>
               </w:rPr>
+              <w:lastRenderedPageBreak/>
               <w:t>form_contact_wassersprudler</w:t>
             </w:r>
             <w:proofErr w:type="spellEnd"/>
@@ -14276,7 +14244,6 @@
                 <w:color w:val="000000"/>
                 <w:sz w:val="17"/>
               </w:rPr>
-              <w:lastRenderedPageBreak/>
               <w:t>RSS_Presse</w:t>
             </w:r>
             <w:proofErr w:type="spellEnd"/>
@@ -14506,6 +14473,7 @@
                 <w:color w:val="000000"/>
                 <w:sz w:val="17"/>
               </w:rPr>
+              <w:lastRenderedPageBreak/>
               <w:t>Service-Box v2</w:t>
             </w:r>
           </w:p>
@@ -16584,7 +16552,6 @@
                 <w:color w:val="000000"/>
                 <w:sz w:val="17"/>
               </w:rPr>
-              <w:lastRenderedPageBreak/>
               <w:t>Top_Navigation_Ebene_1</w:t>
             </w:r>
           </w:p>
@@ -16813,6 +16780,7 @@
                 <w:color w:val="000000"/>
                 <w:sz w:val="17"/>
               </w:rPr>
+              <w:lastRenderedPageBreak/>
               <w:t>Top_Navigation_Ebene_2</w:t>
             </w:r>
           </w:p>
@@ -19433,7 +19401,61 @@
                 <w:color w:val="000000"/>
                 <w:sz w:val="17"/>
               </w:rPr>
-              <w:t xml:space="preserve">Betroffene Contentklassen: formcycle_Formular_Integration sowie die fachspezifischen Klassen form_contact, form_contact_kundenbeirat, form_contact_kundenzentrum, </w:t>
+              <w:t xml:space="preserve">Betroffene Contentklassen: formcycle_Formular_Integration sowie die fachspezifischen Klassen </w:t>
+            </w:r>
+            <w:proofErr w:type="spellStart"/>
+            <w:r>
+              <w:rPr>
+                <w:rFonts w:eastAsia="Calibri"/>
+                <w:color w:val="000000"/>
+                <w:sz w:val="17"/>
+              </w:rPr>
+              <w:t>form_contact</w:t>
+            </w:r>
+            <w:proofErr w:type="spellEnd"/>
+            <w:r>
+              <w:rPr>
+                <w:rFonts w:eastAsia="Calibri"/>
+                <w:color w:val="000000"/>
+                <w:sz w:val="17"/>
+              </w:rPr>
+              <w:t xml:space="preserve">, </w:t>
+            </w:r>
+            <w:proofErr w:type="spellStart"/>
+            <w:r>
+              <w:rPr>
+                <w:rFonts w:eastAsia="Calibri"/>
+                <w:color w:val="000000"/>
+                <w:sz w:val="17"/>
+              </w:rPr>
+              <w:t>form_contact_kundenbeirat</w:t>
+            </w:r>
+            <w:proofErr w:type="spellEnd"/>
+            <w:r>
+              <w:rPr>
+                <w:rFonts w:eastAsia="Calibri"/>
+                <w:color w:val="000000"/>
+                <w:sz w:val="17"/>
+              </w:rPr>
+              <w:t xml:space="preserve">, </w:t>
+            </w:r>
+            <w:proofErr w:type="spellStart"/>
+            <w:r>
+              <w:rPr>
+                <w:rFonts w:eastAsia="Calibri"/>
+                <w:color w:val="000000"/>
+                <w:sz w:val="17"/>
+              </w:rPr>
+              <w:t>form_contact_kundenzentrum</w:t>
+            </w:r>
+            <w:proofErr w:type="spellEnd"/>
+            <w:r>
+              <w:rPr>
+                <w:rFonts w:eastAsia="Calibri"/>
+                <w:color w:val="000000"/>
+                <w:sz w:val="17"/>
+              </w:rPr>
+              <w:t xml:space="preserve">, </w:t>
             </w:r>
             <w:proofErr w:type="spellStart"/>
             <w:r>
@@ -23354,14 +23376,6 @@
             <w:pPr>
               <w:spacing w:after="0" w:line="252" w:lineRule="auto"/>
             </w:pPr>
-            <w:r>
-              <w:rPr>
-                <w:rFonts w:eastAsia="Calibri"/>
-                <w:color w:val="000000"/>
-                <w:sz w:val="18"/>
-              </w:rPr>
-              <w:t>Für den Nachbau im Zielsystem ist je Baustein zu entscheiden, ob er 1:1 übernommen, zusammengefasst oder abgelöst wird. Konsolidierungspotenzial ist vor der Kalkulation zu bewerten.</w:t>
-            </w:r>
           </w:p>
         </w:tc>
       </w:tr>
@@ -24428,15 +24442,7 @@
                 <w:color w:val="000000"/>
                 <w:sz w:val="18"/>
               </w:rPr>
-              <w:t xml:space="preserve">Rechte, Rollen, </w:t>
-            </w:r>
-            <w:r>
-              <w:rPr>
-                <w:rFonts w:eastAsia="Calibri"/>
-                <w:color w:val="000000"/>
-                <w:sz w:val="18"/>
-              </w:rPr>
-              <w:t>Redaktionsprozess und Workflow</w:t>
+              <w:t>Rechte, Rollen, Redaktionsprozess und Workflow</w:t>
             </w:r>
           </w:p>
         </w:tc>

</xml_diff>